<commit_message>
docs(admissions): archive manual test screenshots
</commit_message>
<xml_diff>
--- a/docs/tasks/orchestrator-sessions/orch-20260722-114501/future/Admissions_Application_Future_UX_and_Data_Safety_Work.docx
+++ b/docs/tasks/orchestrator-sessions/orch-20260722-114501/future/Admissions_Application_Future_UX_and_Data_Safety_Work.docx
@@ -2,7 +2,7 @@
 <file path=word/document.xml><?xml version="1.0" encoding="utf-8"?>
 <w:document xmlns:w="http://schemas.openxmlformats.org/wordprocessingml/2006/main" xmlns:m="http://schemas.openxmlformats.org/officeDocument/2006/math" xmlns:r="http://schemas.openxmlformats.org/officeDocument/2006/relationships" xmlns:o="urn:schemas-microsoft-com:office:office" xmlns:v="urn:schemas-microsoft-com:vml" xmlns:w10="urn:schemas-microsoft-com:office:word" xmlns:a="http://schemas.openxmlformats.org/drawingml/2006/main" xmlns:pic="http://schemas.openxmlformats.org/drawingml/2006/picture" xmlns:wp="http://schemas.openxmlformats.org/drawingml/2006/wordprocessingDrawing">
   <w:body>
-    <w:bookmarkStart w:id="36" w:name="Xedd36666c8d4b9977c8903e9d9caed54e42b424"/>
+    <w:bookmarkStart w:id="56" w:name="Xedd36666c8d4b9977c8903e9d9caed54e42b424"/>
     <w:p>
       <w:pPr>
         <w:pStyle w:val="Heading1"/>
@@ -1579,13 +1579,13 @@
     </w:p>
     <w:bookmarkEnd w:id="27"/>
     <w:bookmarkEnd w:id="28"/>
-    <w:bookmarkStart w:id="29" w:name="X1bb483134862d550ca76e4e3b3bdacd125c60b0"/>
+    <w:bookmarkStart w:id="49" w:name="archived-screenshot-evidence"/>
     <w:p>
       <w:pPr>
         <w:pStyle w:val="Heading2"/>
       </w:pPr>
       <w:r>
-        <w:t xml:space="preserve">5. Screenshot evidence recorded from the testing report</w:t>
+        <w:t xml:space="preserve">5. Archived screenshot evidence</w:t>
       </w:r>
     </w:p>
     <w:p>
@@ -1593,29 +1593,79 @@
         <w:pStyle w:val="FirstParagraph"/>
       </w:pPr>
       <w:r>
-        <w:t xml:space="preserve">The supplied screenshots should remain attached to the originating conversation. This section preserves what each image demonstrates for implementation handoff:</w:t>
-      </w:r>
-    </w:p>
-    <w:p>
-      <w:pPr>
-        <w:pStyle w:val="Compact"/>
-        <w:numPr>
-          <w:ilvl w:val="0"/>
-          <w:numId w:val="1016"/>
-        </w:numPr>
+        <w:t xml:space="preserve">The five supplied screenshots are archived verbatim in the repository at:</w:t>
+      </w:r>
+    </w:p>
+    <w:p>
+      <w:pPr>
+        <w:pStyle w:val="BodyText"/>
+      </w:pPr>
+      <w:r>
+        <w:rPr>
+          <w:rStyle w:val="VerbatimChar"/>
+        </w:rPr>
+        <w:t xml:space="preserve">docs/tasks/orchestrator-sessions/orch-20260722-114501/future/evidence/admissions-application-manual-test-2026-07-30/</w:t>
+      </w:r>
+    </w:p>
+    <w:p>
+      <w:pPr>
+        <w:pStyle w:val="BodyText"/>
+      </w:pPr>
+      <w:r>
+        <w:t xml:space="preserve">The folder includes its own</w:t>
+      </w:r>
+      <w:r>
+        <w:t xml:space="preserve"> </w:t>
+      </w:r>
+      <w:r>
+        <w:rPr>
+          <w:rStyle w:val="VerbatimChar"/>
+        </w:rPr>
+        <w:t xml:space="preserve">README.md</w:t>
+      </w:r>
+      <w:r>
+        <w:t xml:space="preserve"> </w:t>
+      </w:r>
+      <w:r>
+        <w:t xml:space="preserve">evidence manifest. Future agents should inspect these files alongside the acceptance criteria above.</w:t>
+      </w:r>
+    </w:p>
+    <w:bookmarkStart w:id="32" w:name="evidence-01-child-and-form-save-failure"/>
+    <w:p>
+      <w:pPr>
+        <w:pStyle w:val="Heading3"/>
+      </w:pPr>
+      <w:r>
+        <w:t xml:space="preserve">Evidence 01 — Child and Form save failure</w:t>
+      </w:r>
+    </w:p>
+    <w:p>
+      <w:pPr>
+        <w:pStyle w:val="FirstParagraph"/>
       </w:pPr>
       <w:r>
         <w:rPr>
           <w:b/>
           <w:bCs/>
         </w:rPr>
-        <w:t xml:space="preserve">Child and Form save failure</w:t>
+        <w:t xml:space="preserve">File:</w:t>
       </w:r>
       <w:r>
         <w:t xml:space="preserve"> </w:t>
       </w:r>
       <w:r>
-        <w:t xml:space="preserve">— legal first name, legal last name, date of birth, and preferred name were populated;</w:t>
+        <w:rPr>
+          <w:rStyle w:val="VerbatimChar"/>
+        </w:rPr>
+        <w:t xml:space="preserve">evidence/admissions-application-manual-test-2026-07-30/01-child-form-save-failure.png</w:t>
+      </w:r>
+    </w:p>
+    <w:p>
+      <w:pPr>
+        <w:pStyle w:val="BodyText"/>
+      </w:pPr>
+      <w:r>
+        <w:t xml:space="preserve">Legal first name, legal last name, date of birth, and preferred name were populated.</w:t>
       </w:r>
       <w:r>
         <w:t xml:space="preserve"> </w:t>
@@ -1631,51 +1681,195 @@
         <w:t xml:space="preserve"> </w:t>
       </w:r>
       <w:r>
-        <w:t xml:space="preserve">returned a generic core-details failure and a persistent error summary.</w:t>
-      </w:r>
-    </w:p>
-    <w:p>
-      <w:pPr>
-        <w:pStyle w:val="Compact"/>
-        <w:numPr>
-          <w:ilvl w:val="0"/>
-          <w:numId w:val="1016"/>
-        </w:numPr>
+        <w:t xml:space="preserve">returned a generic core-details failure and persistent error summary.</w:t>
+      </w:r>
+    </w:p>
+    <w:p>
+      <w:pPr>
+        <w:pStyle w:val="CaptionedFigure"/>
+      </w:pPr>
+      <w:r>
+        <w:drawing>
+          <wp:inline>
+            <wp:extent cx="5334000" cy="2844800"/>
+            <wp:effectExtent b="0" l="0" r="0" t="0"/>
+            <wp:docPr descr="Populated Child and Form section showing a generic save failure" title="" id="30" name="Picture"/>
+            <a:graphic>
+              <a:graphicData uri="http://schemas.openxmlformats.org/drawingml/2006/picture">
+                <pic:pic>
+                  <pic:nvPicPr>
+                    <pic:cNvPr descr="evidence/admissions-application-manual-test-2026-07-30/01-child-form-save-failure.png" id="31" name="Picture"/>
+                    <pic:cNvPicPr>
+                      <a:picLocks noChangeArrowheads="1" noChangeAspect="1"/>
+                    </pic:cNvPicPr>
+                  </pic:nvPicPr>
+                  <pic:blipFill>
+                    <a:blip r:embed="rId29"/>
+                    <a:stretch>
+                      <a:fillRect/>
+                    </a:stretch>
+                  </pic:blipFill>
+                  <pic:spPr bwMode="auto">
+                    <a:xfrm>
+                      <a:off x="0" y="0"/>
+                      <a:ext cx="5334000" cy="2844800"/>
+                    </a:xfrm>
+                    <a:prstGeom prst="rect">
+                      <a:avLst/>
+                    </a:prstGeom>
+                    <a:noFill/>
+                    <a:ln w="9525">
+                      <a:noFill/>
+                      <a:headEnd/>
+                      <a:tailEnd/>
+                    </a:ln>
+                  </pic:spPr>
+                </pic:pic>
+              </a:graphicData>
+            </a:graphic>
+          </wp:inline>
+        </w:drawing>
+      </w:r>
+    </w:p>
+    <w:p>
+      <w:pPr>
+        <w:pStyle w:val="ImageCaption"/>
+      </w:pPr>
+      <w:r>
+        <w:t xml:space="preserve">Populated Child and Form section showing a generic save failure</w:t>
+      </w:r>
+    </w:p>
+    <w:bookmarkEnd w:id="32"/>
+    <w:bookmarkStart w:id="36" w:name="X1f15affad532fd0911eb55c352779bf6edd783b"/>
+    <w:p>
+      <w:pPr>
+        <w:pStyle w:val="Heading3"/>
+      </w:pPr>
+      <w:r>
+        <w:t xml:space="preserve">Evidence 02 — Stale error on Guardian Contact</w:t>
+      </w:r>
+    </w:p>
+    <w:p>
+      <w:pPr>
+        <w:pStyle w:val="FirstParagraph"/>
       </w:pPr>
       <w:r>
         <w:rPr>
           <w:b/>
           <w:bCs/>
         </w:rPr>
-        <w:t xml:space="preserve">Guardian Contact initial view</w:t>
+        <w:t xml:space="preserve">File:</w:t>
       </w:r>
       <w:r>
         <w:t xml:space="preserve"> </w:t>
       </w:r>
       <w:r>
-        <w:t xml:space="preserve">— the previous core-details error remained visible after changing sections, while the contact form displayed Full name, Relationship, Email, and Phone.</w:t>
-      </w:r>
-    </w:p>
-    <w:p>
-      <w:pPr>
-        <w:pStyle w:val="Compact"/>
-        <w:numPr>
-          <w:ilvl w:val="0"/>
-          <w:numId w:val="1016"/>
-        </w:numPr>
+        <w:rPr>
+          <w:rStyle w:val="VerbatimChar"/>
+        </w:rPr>
+        <w:t xml:space="preserve">evidence/admissions-application-manual-test-2026-07-30/02-guardian-contact-stale-error.png</w:t>
+      </w:r>
+    </w:p>
+    <w:p>
+      <w:pPr>
+        <w:pStyle w:val="BodyText"/>
+      </w:pPr>
+      <w:r>
+        <w:t xml:space="preserve">The previous core-details error remained visible after changing sections, while Guardian Contact displayed Full name, Relationship, Email, and Phone.</w:t>
+      </w:r>
+    </w:p>
+    <w:p>
+      <w:pPr>
+        <w:pStyle w:val="CaptionedFigure"/>
+      </w:pPr>
+      <w:r>
+        <w:drawing>
+          <wp:inline>
+            <wp:extent cx="5334000" cy="2844800"/>
+            <wp:effectExtent b="0" l="0" r="0" t="0"/>
+            <wp:docPr descr="Guardian Contact section retaining an unrelated core-details error" title="" id="34" name="Picture"/>
+            <a:graphic>
+              <a:graphicData uri="http://schemas.openxmlformats.org/drawingml/2006/picture">
+                <pic:pic>
+                  <pic:nvPicPr>
+                    <pic:cNvPr descr="evidence/admissions-application-manual-test-2026-07-30/02-guardian-contact-stale-error.png" id="35" name="Picture"/>
+                    <pic:cNvPicPr>
+                      <a:picLocks noChangeArrowheads="1" noChangeAspect="1"/>
+                    </pic:cNvPicPr>
+                  </pic:nvPicPr>
+                  <pic:blipFill>
+                    <a:blip r:embed="rId33"/>
+                    <a:stretch>
+                      <a:fillRect/>
+                    </a:stretch>
+                  </pic:blipFill>
+                  <pic:spPr bwMode="auto">
+                    <a:xfrm>
+                      <a:off x="0" y="0"/>
+                      <a:ext cx="5334000" cy="2844800"/>
+                    </a:xfrm>
+                    <a:prstGeom prst="rect">
+                      <a:avLst/>
+                    </a:prstGeom>
+                    <a:noFill/>
+                    <a:ln w="9525">
+                      <a:noFill/>
+                      <a:headEnd/>
+                      <a:tailEnd/>
+                    </a:ln>
+                  </pic:spPr>
+                </pic:pic>
+              </a:graphicData>
+            </a:graphic>
+          </wp:inline>
+        </w:drawing>
+      </w:r>
+    </w:p>
+    <w:p>
+      <w:pPr>
+        <w:pStyle w:val="ImageCaption"/>
+      </w:pPr>
+      <w:r>
+        <w:t xml:space="preserve">Guardian Contact section retaining an unrelated core-details error</w:t>
+      </w:r>
+    </w:p>
+    <w:bookmarkEnd w:id="36"/>
+    <w:bookmarkStart w:id="40" w:name="X9d76322f7baf1956f2436d99ea557dbf43bccde"/>
+    <w:p>
+      <w:pPr>
+        <w:pStyle w:val="Heading3"/>
+      </w:pPr>
+      <w:r>
+        <w:t xml:space="preserve">Evidence 03 — Populated guardian contact save failure</w:t>
+      </w:r>
+    </w:p>
+    <w:p>
+      <w:pPr>
+        <w:pStyle w:val="FirstParagraph"/>
       </w:pPr>
       <w:r>
         <w:rPr>
           <w:b/>
           <w:bCs/>
         </w:rPr>
-        <w:t xml:space="preserve">Guardian Contact populated failure</w:t>
+        <w:t xml:space="preserve">File:</w:t>
       </w:r>
       <w:r>
         <w:t xml:space="preserve"> </w:t>
       </w:r>
       <w:r>
-        <w:t xml:space="preserve">— name, relationship, email, and phone were populated;</w:t>
+        <w:rPr>
+          <w:rStyle w:val="VerbatimChar"/>
+        </w:rPr>
+        <w:t xml:space="preserve">evidence/admissions-application-manual-test-2026-07-30/03-guardian-contact-save-failure.png</w:t>
+      </w:r>
+    </w:p>
+    <w:p>
+      <w:pPr>
+        <w:pStyle w:val="BodyText"/>
+      </w:pPr>
+      <w:r>
+        <w:t xml:space="preserve">Name, relationship, email, and phone were populated.</w:t>
       </w:r>
       <w:r>
         <w:t xml:space="preserve"> </w:t>
@@ -1691,29 +1885,101 @@
         <w:t xml:space="preserve"> </w:t>
       </w:r>
       <w:r>
-        <w:t xml:space="preserve">still returned a generic contact failure without identifying a field.</w:t>
-      </w:r>
-    </w:p>
-    <w:p>
-      <w:pPr>
-        <w:pStyle w:val="Compact"/>
-        <w:numPr>
-          <w:ilvl w:val="0"/>
-          <w:numId w:val="1016"/>
-        </w:numPr>
+        <w:t xml:space="preserve">still returned a generic failure without identifying the rejected field.</w:t>
+      </w:r>
+    </w:p>
+    <w:p>
+      <w:pPr>
+        <w:pStyle w:val="CaptionedFigure"/>
+      </w:pPr>
+      <w:r>
+        <w:drawing>
+          <wp:inline>
+            <wp:extent cx="5334000" cy="2844800"/>
+            <wp:effectExtent b="0" l="0" r="0" t="0"/>
+            <wp:docPr descr="Populated Guardian Contact section showing a generic save failure" title="" id="38" name="Picture"/>
+            <a:graphic>
+              <a:graphicData uri="http://schemas.openxmlformats.org/drawingml/2006/picture">
+                <pic:pic>
+                  <pic:nvPicPr>
+                    <pic:cNvPr descr="evidence/admissions-application-manual-test-2026-07-30/03-guardian-contact-save-failure.png" id="39" name="Picture"/>
+                    <pic:cNvPicPr>
+                      <a:picLocks noChangeArrowheads="1" noChangeAspect="1"/>
+                    </pic:cNvPicPr>
+                  </pic:nvPicPr>
+                  <pic:blipFill>
+                    <a:blip r:embed="rId37"/>
+                    <a:stretch>
+                      <a:fillRect/>
+                    </a:stretch>
+                  </pic:blipFill>
+                  <pic:spPr bwMode="auto">
+                    <a:xfrm>
+                      <a:off x="0" y="0"/>
+                      <a:ext cx="5334000" cy="2844800"/>
+                    </a:xfrm>
+                    <a:prstGeom prst="rect">
+                      <a:avLst/>
+                    </a:prstGeom>
+                    <a:noFill/>
+                    <a:ln w="9525">
+                      <a:noFill/>
+                      <a:headEnd/>
+                      <a:tailEnd/>
+                    </a:ln>
+                  </pic:spPr>
+                </pic:pic>
+              </a:graphicData>
+            </a:graphic>
+          </wp:inline>
+        </w:drawing>
+      </w:r>
+    </w:p>
+    <w:p>
+      <w:pPr>
+        <w:pStyle w:val="ImageCaption"/>
+      </w:pPr>
+      <w:r>
+        <w:t xml:space="preserve">Populated Guardian Contact section showing a generic save failure</w:t>
+      </w:r>
+    </w:p>
+    <w:bookmarkEnd w:id="40"/>
+    <w:bookmarkStart w:id="44" w:name="evidence-04-raw-convex-document-url"/>
+    <w:p>
+      <w:pPr>
+        <w:pStyle w:val="Heading3"/>
+      </w:pPr>
+      <w:r>
+        <w:t xml:space="preserve">Evidence 04 — Raw Convex document URL</w:t>
+      </w:r>
+    </w:p>
+    <w:p>
+      <w:pPr>
+        <w:pStyle w:val="FirstParagraph"/>
       </w:pPr>
       <w:r>
         <w:rPr>
           <w:b/>
           <w:bCs/>
         </w:rPr>
-        <w:t xml:space="preserve">Raw document location</w:t>
+        <w:t xml:space="preserve">File:</w:t>
       </w:r>
       <w:r>
         <w:t xml:space="preserve"> </w:t>
       </w:r>
       <w:r>
-        <w:t xml:space="preserve">— selecting a document opened a direct development Convex</w:t>
+        <w:rPr>
+          <w:rStyle w:val="VerbatimChar"/>
+        </w:rPr>
+        <w:t xml:space="preserve">evidence/admissions-application-manual-test-2026-07-30/04-raw-convex-storage-url.png</w:t>
+      </w:r>
+    </w:p>
+    <w:p>
+      <w:pPr>
+        <w:pStyle w:val="BodyText"/>
+      </w:pPr>
+      <w:r>
+        <w:t xml:space="preserve">Selecting a document opened a direct development Convex</w:t>
       </w:r>
       <w:r>
         <w:t xml:space="preserve"> </w:t>
@@ -1733,24 +1999,96 @@
     </w:p>
     <w:p>
       <w:pPr>
-        <w:pStyle w:val="Compact"/>
-        <w:numPr>
-          <w:ilvl w:val="0"/>
-          <w:numId w:val="1016"/>
-        </w:numPr>
+        <w:pStyle w:val="CaptionedFigure"/>
+      </w:pPr>
+      <w:r>
+        <w:drawing>
+          <wp:inline>
+            <wp:extent cx="5334000" cy="1567252"/>
+            <wp:effectExtent b="0" l="0" r="0" t="0"/>
+            <wp:docPr descr="Browser address bar exposing the raw Convex document storage URL" title="" id="42" name="Picture"/>
+            <a:graphic>
+              <a:graphicData uri="http://schemas.openxmlformats.org/drawingml/2006/picture">
+                <pic:pic>
+                  <pic:nvPicPr>
+                    <pic:cNvPr descr="evidence/admissions-application-manual-test-2026-07-30/04-raw-convex-storage-url.png" id="43" name="Picture"/>
+                    <pic:cNvPicPr>
+                      <a:picLocks noChangeArrowheads="1" noChangeAspect="1"/>
+                    </pic:cNvPicPr>
+                  </pic:nvPicPr>
+                  <pic:blipFill>
+                    <a:blip r:embed="rId41"/>
+                    <a:stretch>
+                      <a:fillRect/>
+                    </a:stretch>
+                  </pic:blipFill>
+                  <pic:spPr bwMode="auto">
+                    <a:xfrm>
+                      <a:off x="0" y="0"/>
+                      <a:ext cx="5334000" cy="1567252"/>
+                    </a:xfrm>
+                    <a:prstGeom prst="rect">
+                      <a:avLst/>
+                    </a:prstGeom>
+                    <a:noFill/>
+                    <a:ln w="9525">
+                      <a:noFill/>
+                      <a:headEnd/>
+                      <a:tailEnd/>
+                    </a:ln>
+                  </pic:spPr>
+                </pic:pic>
+              </a:graphicData>
+            </a:graphic>
+          </wp:inline>
+        </w:drawing>
+      </w:r>
+    </w:p>
+    <w:p>
+      <w:pPr>
+        <w:pStyle w:val="ImageCaption"/>
+      </w:pPr>
+      <w:r>
+        <w:t xml:space="preserve">Browser address bar exposing the raw Convex document storage URL</w:t>
+      </w:r>
+    </w:p>
+    <w:bookmarkEnd w:id="44"/>
+    <w:bookmarkStart w:id="48" w:name="evidence-05-no-document-deletion-action"/>
+    <w:p>
+      <w:pPr>
+        <w:pStyle w:val="Heading3"/>
+      </w:pPr>
+      <w:r>
+        <w:t xml:space="preserve">Evidence 05 — No document deletion action</w:t>
+      </w:r>
+    </w:p>
+    <w:p>
+      <w:pPr>
+        <w:pStyle w:val="FirstParagraph"/>
       </w:pPr>
       <w:r>
         <w:rPr>
           <w:b/>
           <w:bCs/>
         </w:rPr>
-        <w:t xml:space="preserve">Documents list limitations</w:t>
+        <w:t xml:space="preserve">File:</w:t>
       </w:r>
       <w:r>
         <w:t xml:space="preserve"> </w:t>
       </w:r>
       <w:r>
-        <w:t xml:space="preserve">— uploaded and superseded files were visible with</w:t>
+        <w:rPr>
+          <w:rStyle w:val="VerbatimChar"/>
+        </w:rPr>
+        <w:t xml:space="preserve">evidence/admissions-application-manual-test-2026-07-30/05-documents-list-no-delete.png</w:t>
+      </w:r>
+    </w:p>
+    <w:p>
+      <w:pPr>
+        <w:pStyle w:val="BodyText"/>
+      </w:pPr>
+      <w:r>
+        <w:t xml:space="preserve">Uploaded and superseded files were visible with</w:t>
       </w:r>
       <w:r>
         <w:t xml:space="preserve"> </w:t>
@@ -1768,10 +2106,65 @@
     </w:p>
     <w:p>
       <w:pPr>
-        <w:pStyle w:val="FirstParagraph"/>
-      </w:pPr>
-      <w:r>
-        <w:t xml:space="preserve">No production secrets or payment credentials are included in this document.</w:t>
+        <w:pStyle w:val="CaptionedFigure"/>
+      </w:pPr>
+      <w:r>
+        <w:drawing>
+          <wp:inline>
+            <wp:extent cx="5334000" cy="2844800"/>
+            <wp:effectExtent b="0" l="0" r="0" t="0"/>
+            <wp:docPr descr="Documents section listing uploaded files without a remove action" title="" id="46" name="Picture"/>
+            <a:graphic>
+              <a:graphicData uri="http://schemas.openxmlformats.org/drawingml/2006/picture">
+                <pic:pic>
+                  <pic:nvPicPr>
+                    <pic:cNvPr descr="evidence/admissions-application-manual-test-2026-07-30/05-documents-list-no-delete.png" id="47" name="Picture"/>
+                    <pic:cNvPicPr>
+                      <a:picLocks noChangeArrowheads="1" noChangeAspect="1"/>
+                    </pic:cNvPicPr>
+                  </pic:nvPicPr>
+                  <pic:blipFill>
+                    <a:blip r:embed="rId45"/>
+                    <a:stretch>
+                      <a:fillRect/>
+                    </a:stretch>
+                  </pic:blipFill>
+                  <pic:spPr bwMode="auto">
+                    <a:xfrm>
+                      <a:off x="0" y="0"/>
+                      <a:ext cx="5334000" cy="2844800"/>
+                    </a:xfrm>
+                    <a:prstGeom prst="rect">
+                      <a:avLst/>
+                    </a:prstGeom>
+                    <a:noFill/>
+                    <a:ln w="9525">
+                      <a:noFill/>
+                      <a:headEnd/>
+                      <a:tailEnd/>
+                    </a:ln>
+                  </pic:spPr>
+                </pic:pic>
+              </a:graphicData>
+            </a:graphic>
+          </wp:inline>
+        </w:drawing>
+      </w:r>
+    </w:p>
+    <w:p>
+      <w:pPr>
+        <w:pStyle w:val="ImageCaption"/>
+      </w:pPr>
+      <w:r>
+        <w:t xml:space="preserve">Documents section listing uploaded files without a remove action</w:t>
+      </w:r>
+    </w:p>
+    <w:p>
+      <w:pPr>
+        <w:pStyle w:val="BodyText"/>
+      </w:pPr>
+      <w:r>
+        <w:t xml:space="preserve">The screenshots contain development test data and browser chrome. Treat them as internal engineering evidence. No production secrets or payment credentials are included.</w:t>
       </w:r>
     </w:p>
     <w:p>
@@ -1781,8 +2174,9 @@
         </w:pict>
       </w:r>
     </w:p>
-    <w:bookmarkEnd w:id="29"/>
-    <w:bookmarkStart w:id="34" w:name="recommended-implementation-order"/>
+    <w:bookmarkEnd w:id="48"/>
+    <w:bookmarkEnd w:id="49"/>
+    <w:bookmarkStart w:id="54" w:name="recommended-implementation-order"/>
     <w:p>
       <w:pPr>
         <w:pStyle w:val="Heading2"/>
@@ -1791,7 +2185,7 @@
         <w:t xml:space="preserve">6. Recommended implementation order</w:t>
       </w:r>
     </w:p>
-    <w:bookmarkStart w:id="30" w:name="first-future-pass-batch-1"/>
+    <w:bookmarkStart w:id="50" w:name="first-future-pass-batch-1"/>
     <w:p>
       <w:pPr>
         <w:pStyle w:val="Heading3"/>
@@ -1808,8 +2202,8 @@
         <w:t xml:space="preserve">Fix the actual save mutation failure first, then implement partial draft persistence, autosave, offline recovery, and unambiguous progression. Data-loss prevention is the highest priority and should be resolved before gathering further application content.</w:t>
       </w:r>
     </w:p>
-    <w:bookmarkEnd w:id="30"/>
-    <w:bookmarkStart w:id="31" w:name="second-future-pass-batch-2"/>
+    <w:bookmarkEnd w:id="50"/>
+    <w:bookmarkStart w:id="51" w:name="second-future-pass-batch-2"/>
     <w:p>
       <w:pPr>
         <w:pStyle w:val="Heading3"/>
@@ -1826,8 +2220,8 @@
         <w:t xml:space="preserve">Introduce the legal-name model through a migration and form-versioning plan that preserves existing records and submitted snapshots.</w:t>
       </w:r>
     </w:p>
-    <w:bookmarkEnd w:id="31"/>
-    <w:bookmarkStart w:id="32" w:name="third-future-pass-batch-3"/>
+    <w:bookmarkEnd w:id="51"/>
+    <w:bookmarkStart w:id="52" w:name="third-future-pass-batch-3"/>
     <w:p>
       <w:pPr>
         <w:pStyle w:val="Heading3"/>
@@ -1844,8 +2238,8 @@
         <w:t xml:space="preserve">Add same-origin private document viewing and controlled upload deletion/replacement, with server-side authorization and audit behavior reviewed together.</w:t>
       </w:r>
     </w:p>
-    <w:bookmarkEnd w:id="32"/>
-    <w:bookmarkStart w:id="33" w:name="final-regression-pass"/>
+    <w:bookmarkEnd w:id="52"/>
+    <w:bookmarkStart w:id="53" w:name="final-regression-pass"/>
     <w:p>
       <w:pPr>
         <w:pStyle w:val="Heading3"/>
@@ -1867,7 +2261,7 @@
         <w:pStyle w:val="Compact"/>
         <w:numPr>
           <w:ilvl w:val="0"/>
-          <w:numId w:val="1017"/>
+          <w:numId w:val="1016"/>
         </w:numPr>
       </w:pPr>
       <w:r>
@@ -1879,7 +2273,7 @@
         <w:pStyle w:val="Compact"/>
         <w:numPr>
           <w:ilvl w:val="0"/>
-          <w:numId w:val="1017"/>
+          <w:numId w:val="1016"/>
         </w:numPr>
       </w:pPr>
       <w:r>
@@ -1891,7 +2285,7 @@
         <w:pStyle w:val="Compact"/>
         <w:numPr>
           <w:ilvl w:val="0"/>
-          <w:numId w:val="1017"/>
+          <w:numId w:val="1016"/>
         </w:numPr>
       </w:pPr>
       <w:r>
@@ -1903,7 +2297,7 @@
         <w:pStyle w:val="Compact"/>
         <w:numPr>
           <w:ilvl w:val="0"/>
-          <w:numId w:val="1017"/>
+          <w:numId w:val="1016"/>
         </w:numPr>
       </w:pPr>
       <w:r>
@@ -1915,7 +2309,7 @@
         <w:pStyle w:val="Compact"/>
         <w:numPr>
           <w:ilvl w:val="0"/>
-          <w:numId w:val="1017"/>
+          <w:numId w:val="1016"/>
         </w:numPr>
       </w:pPr>
       <w:r>
@@ -1927,7 +2321,7 @@
         <w:pStyle w:val="Compact"/>
         <w:numPr>
           <w:ilvl w:val="0"/>
-          <w:numId w:val="1017"/>
+          <w:numId w:val="1016"/>
         </w:numPr>
       </w:pPr>
       <w:r>
@@ -1939,7 +2333,7 @@
         <w:pStyle w:val="Compact"/>
         <w:numPr>
           <w:ilvl w:val="0"/>
-          <w:numId w:val="1017"/>
+          <w:numId w:val="1016"/>
         </w:numPr>
       </w:pPr>
       <w:r>
@@ -1953,9 +2347,9 @@
         </w:pict>
       </w:r>
     </w:p>
-    <w:bookmarkEnd w:id="33"/>
-    <w:bookmarkEnd w:id="34"/>
-    <w:bookmarkStart w:id="35" w:name="X2227cb88907e8ec69b62946f49b4e3649f4657b"/>
+    <w:bookmarkEnd w:id="53"/>
+    <w:bookmarkEnd w:id="54"/>
+    <w:bookmarkStart w:id="55" w:name="X2227cb88907e8ec69b62946f49b4e3649f4657b"/>
     <w:p>
       <w:pPr>
         <w:pStyle w:val="Heading2"/>
@@ -1969,7 +2363,7 @@
         <w:pStyle w:val="Compact"/>
         <w:numPr>
           <w:ilvl w:val="0"/>
-          <w:numId w:val="1018"/>
+          <w:numId w:val="1017"/>
         </w:numPr>
       </w:pPr>
       <w:r>
@@ -1981,7 +2375,7 @@
         <w:pStyle w:val="Compact"/>
         <w:numPr>
           <w:ilvl w:val="0"/>
-          <w:numId w:val="1018"/>
+          <w:numId w:val="1017"/>
         </w:numPr>
       </w:pPr>
       <w:r>
@@ -1993,7 +2387,7 @@
         <w:pStyle w:val="Compact"/>
         <w:numPr>
           <w:ilvl w:val="0"/>
-          <w:numId w:val="1018"/>
+          <w:numId w:val="1017"/>
         </w:numPr>
       </w:pPr>
       <w:r>
@@ -2005,7 +2399,7 @@
         <w:pStyle w:val="Compact"/>
         <w:numPr>
           <w:ilvl w:val="0"/>
-          <w:numId w:val="1018"/>
+          <w:numId w:val="1017"/>
         </w:numPr>
       </w:pPr>
       <w:r>
@@ -2017,7 +2411,7 @@
         <w:pStyle w:val="Compact"/>
         <w:numPr>
           <w:ilvl w:val="0"/>
-          <w:numId w:val="1018"/>
+          <w:numId w:val="1017"/>
         </w:numPr>
       </w:pPr>
       <w:r>
@@ -2029,7 +2423,7 @@
         <w:pStyle w:val="Compact"/>
         <w:numPr>
           <w:ilvl w:val="0"/>
-          <w:numId w:val="1018"/>
+          <w:numId w:val="1017"/>
         </w:numPr>
       </w:pPr>
       <w:r>
@@ -2044,8 +2438,8 @@
         <w:t xml:space="preserve">This document is the scope boundary for future work and should be updated with implementation notes and verification results when each batch is started.</w:t>
       </w:r>
     </w:p>
-    <w:bookmarkEnd w:id="35"/>
-    <w:bookmarkEnd w:id="36"/>
+    <w:bookmarkEnd w:id="55"/>
+    <w:bookmarkEnd w:id="56"/>
     <w:sectPr>
       <w:footnotePr>
         <w:numRestart w:val="eachSect"/>
@@ -2450,36 +2844,6 @@
     </w:lvlOverride>
   </w:num>
   <w:num w:numId="1017">
-    <w:abstractNumId w:val="99411"/>
-    <w:lvlOverride w:ilvl="0">
-      <w:startOverride w:val="1"/>
-    </w:lvlOverride>
-    <w:lvlOverride w:ilvl="1">
-      <w:startOverride w:val="1"/>
-    </w:lvlOverride>
-    <w:lvlOverride w:ilvl="2">
-      <w:startOverride w:val="1"/>
-    </w:lvlOverride>
-    <w:lvlOverride w:ilvl="3">
-      <w:startOverride w:val="1"/>
-    </w:lvlOverride>
-    <w:lvlOverride w:ilvl="4">
-      <w:startOverride w:val="1"/>
-    </w:lvlOverride>
-    <w:lvlOverride w:ilvl="5">
-      <w:startOverride w:val="1"/>
-    </w:lvlOverride>
-    <w:lvlOverride w:ilvl="6">
-      <w:startOverride w:val="1"/>
-    </w:lvlOverride>
-    <w:lvlOverride w:ilvl="7">
-      <w:startOverride w:val="1"/>
-    </w:lvlOverride>
-    <w:lvlOverride w:ilvl="8">
-      <w:startOverride w:val="1"/>
-    </w:lvlOverride>
-  </w:num>
-  <w:num w:numId="1018">
     <w:abstractNumId w:val="991"/>
   </w:num>
 </w:numbering>

</xml_diff>